<commit_message>
Final tweaks to documentation and .gitignore
</commit_message>
<xml_diff>
--- a/Feedback Loop Documentation.docx
+++ b/Feedback Loop Documentation.docx
@@ -101,7 +101,23 @@
           <w:rFonts w:ascii="Aptos" w:hAnsi="Aptos"/>
           <w:bCs/>
         </w:rPr>
-        <w:t xml:space="preserve"> Iro Ntonia; Zohaib Akhtar</w:t>
+        <w:t xml:space="preserve"> Iro </w:t>
+      </w:r>
+      <w:proofErr w:type="spellStart"/>
+      <w:r>
+        <w:rPr>
+          <w:rFonts w:ascii="Aptos" w:hAnsi="Aptos"/>
+          <w:bCs/>
+        </w:rPr>
+        <w:t>Ntonia</w:t>
+      </w:r>
+      <w:proofErr w:type="spellEnd"/>
+      <w:r>
+        <w:rPr>
+          <w:rFonts w:ascii="Aptos" w:hAnsi="Aptos"/>
+          <w:bCs/>
+        </w:rPr>
+        <w:t>; Zohaib Akhtar</w:t>
       </w:r>
     </w:p>
     <w:p>
@@ -1277,6 +1293,48 @@
     </w:p>
     <w:p>
       <w:pPr>
+        <w:rPr>
+          <w:rFonts w:ascii="Aptos" w:hAnsi="Aptos"/>
+        </w:rPr>
+      </w:pPr>
+    </w:p>
+    <w:p>
+      <w:r>
+        <w:rPr>
+          <w:rFonts w:ascii="Aptos" w:hAnsi="Aptos"/>
+        </w:rPr>
+        <w:t>F</w:t>
+      </w:r>
+      <w:r>
+        <w:rPr>
+          <w:rFonts w:ascii="Aptos" w:hAnsi="Aptos"/>
+        </w:rPr>
+        <w:t xml:space="preserve">rom the </w:t>
+      </w:r>
+      <w:r>
+        <w:rPr>
+          <w:rStyle w:val="VerbatimChar"/>
+          <w:rFonts w:ascii="Courier New" w:hAnsi="Courier New" w:cs="Courier New"/>
+          <w:b/>
+          <w:bCs/>
+        </w:rPr>
+        <w:t>project/</w:t>
+      </w:r>
+      <w:r>
+        <w:rPr>
+          <w:rFonts w:ascii="Aptos" w:hAnsi="Aptos"/>
+        </w:rPr>
+        <w:t xml:space="preserve"> directory</w:t>
+      </w:r>
+      <w:r>
+        <w:rPr>
+          <w:rFonts w:ascii="Aptos" w:hAnsi="Aptos"/>
+        </w:rPr>
+        <w:t>:</w:t>
+      </w:r>
+    </w:p>
+    <w:p>
+      <w:pPr>
         <w:pStyle w:val="Heading3"/>
         <w:numPr>
           <w:ilvl w:val="0"/>
@@ -1304,34 +1362,7 @@
           <w:sz w:val="22"/>
           <w:szCs w:val="22"/>
         </w:rPr>
-        <w:t>, f</w:t>
-      </w:r>
-      <w:r>
-        <w:rPr>
-          <w:rFonts w:ascii="Aptos" w:hAnsi="Aptos"/>
-          <w:sz w:val="22"/>
-          <w:szCs w:val="22"/>
-        </w:rPr>
-        <w:t xml:space="preserve">rom the </w:t>
-      </w:r>
-      <w:r>
-        <w:rPr>
-          <w:rStyle w:val="VerbatimChar"/>
-          <w:rFonts w:ascii="Courier New" w:hAnsi="Courier New" w:cs="Courier New"/>
-          <w:b/>
-          <w:bCs/>
-          <w:sz w:val="22"/>
-          <w:szCs w:val="22"/>
-        </w:rPr>
-        <w:t>project/</w:t>
-      </w:r>
-      <w:r>
-        <w:rPr>
-          <w:rFonts w:ascii="Aptos" w:hAnsi="Aptos"/>
-          <w:sz w:val="22"/>
-          <w:szCs w:val="22"/>
-        </w:rPr>
-        <w:t xml:space="preserve"> directory:</w:t>
+        <w:t>:</w:t>
       </w:r>
     </w:p>
     <w:p>
@@ -1381,6 +1412,7 @@
         </w:rPr>
         <w:t xml:space="preserve"> </w:t>
       </w:r>
+      <w:proofErr w:type="spellStart"/>
       <w:proofErr w:type="gramStart"/>
       <w:r>
         <w:rPr>
@@ -1389,9 +1421,9 @@
           <w:b/>
           <w:bCs/>
         </w:rPr>
-        <w:t>venv .venv</w:t>
-      </w:r>
-      <w:proofErr w:type="gramEnd"/>
+        <w:t>venv</w:t>
+      </w:r>
+      <w:proofErr w:type="spellEnd"/>
       <w:r>
         <w:rPr>
           <w:rStyle w:val="NormalTok"/>
@@ -1399,8 +1431,9 @@
           <w:b/>
           <w:bCs/>
         </w:rPr>
-        <w:br/>
-      </w:r>
+        <w:t xml:space="preserve"> .</w:t>
+      </w:r>
+      <w:proofErr w:type="spellStart"/>
       <w:r>
         <w:rPr>
           <w:rStyle w:val="NormalTok"/>
@@ -1408,23 +1441,10 @@
           <w:b/>
           <w:bCs/>
         </w:rPr>
-        <w:br/>
-      </w:r>
-      <w:r>
-        <w:rPr>
-          <w:rFonts w:ascii="Aptos" w:hAnsi="Aptos"/>
-        </w:rPr>
-        <w:t>Activate it on macOS/Linux:</w:t>
-      </w:r>
-      <w:r>
-        <w:rPr>
-          <w:rFonts w:ascii="Courier New" w:hAnsi="Courier New" w:cs="Courier New"/>
-          <w:b/>
-          <w:bCs/>
-        </w:rPr>
-        <w:br/>
-      </w:r>
-      <w:proofErr w:type="gramStart"/>
+        <w:t>venv</w:t>
+      </w:r>
+      <w:proofErr w:type="spellEnd"/>
+      <w:proofErr w:type="gramEnd"/>
       <w:r>
         <w:rPr>
           <w:rStyle w:val="NormalTok"/>
@@ -1432,9 +1452,8 @@
           <w:b/>
           <w:bCs/>
         </w:rPr>
-        <w:t>source .venv</w:t>
-      </w:r>
-      <w:proofErr w:type="gramEnd"/>
+        <w:br/>
+      </w:r>
       <w:r>
         <w:rPr>
           <w:rStyle w:val="NormalTok"/>
@@ -1442,8 +1461,23 @@
           <w:b/>
           <w:bCs/>
         </w:rPr>
-        <w:t>/bin/activate</w:t>
-      </w:r>
+        <w:br/>
+      </w:r>
+      <w:r>
+        <w:rPr>
+          <w:rFonts w:ascii="Aptos" w:hAnsi="Aptos"/>
+        </w:rPr>
+        <w:t>Activate it on macOS/Linux:</w:t>
+      </w:r>
+      <w:r>
+        <w:rPr>
+          <w:rFonts w:ascii="Courier New" w:hAnsi="Courier New" w:cs="Courier New"/>
+          <w:b/>
+          <w:bCs/>
+        </w:rPr>
+        <w:br/>
+      </w:r>
+      <w:proofErr w:type="gramStart"/>
       <w:r>
         <w:rPr>
           <w:rStyle w:val="NormalTok"/>
@@ -1451,8 +1485,9 @@
           <w:b/>
           <w:bCs/>
         </w:rPr>
-        <w:br/>
-      </w:r>
+        <w:t>source .</w:t>
+      </w:r>
+      <w:proofErr w:type="spellStart"/>
       <w:r>
         <w:rPr>
           <w:rStyle w:val="NormalTok"/>
@@ -1460,22 +1495,10 @@
           <w:b/>
           <w:bCs/>
         </w:rPr>
-        <w:br/>
-      </w:r>
-      <w:r>
-        <w:rPr>
-          <w:rFonts w:ascii="Aptos" w:hAnsi="Aptos"/>
-        </w:rPr>
-        <w:t>Activate it on Windows PowerShell:</w:t>
-      </w:r>
-      <w:r>
-        <w:rPr>
-          <w:rFonts w:ascii="Courier New" w:hAnsi="Courier New" w:cs="Courier New"/>
-          <w:b/>
-          <w:bCs/>
-        </w:rPr>
-        <w:br/>
-      </w:r>
+        <w:t>venv</w:t>
+      </w:r>
+      <w:proofErr w:type="spellEnd"/>
+      <w:proofErr w:type="gramEnd"/>
       <w:r>
         <w:rPr>
           <w:rStyle w:val="NormalTok"/>
@@ -1483,7 +1506,82 @@
           <w:b/>
           <w:bCs/>
         </w:rPr>
-        <w:t>.venv\Scripts\Activate.ps1</w:t>
+        <w:t>/bin/activate</w:t>
+      </w:r>
+      <w:r>
+        <w:rPr>
+          <w:rStyle w:val="NormalTok"/>
+          <w:rFonts w:ascii="Courier New" w:hAnsi="Courier New" w:cs="Courier New"/>
+          <w:b/>
+          <w:bCs/>
+        </w:rPr>
+        <w:br/>
+      </w:r>
+      <w:r>
+        <w:rPr>
+          <w:rStyle w:val="NormalTok"/>
+          <w:rFonts w:ascii="Courier New" w:hAnsi="Courier New" w:cs="Courier New"/>
+          <w:b/>
+          <w:bCs/>
+        </w:rPr>
+        <w:br/>
+      </w:r>
+      <w:r>
+        <w:rPr>
+          <w:rFonts w:ascii="Aptos" w:hAnsi="Aptos"/>
+        </w:rPr>
+        <w:t>Activate it on Windows:</w:t>
+      </w:r>
+      <w:r>
+        <w:rPr>
+          <w:rFonts w:ascii="Courier New" w:hAnsi="Courier New" w:cs="Courier New"/>
+          <w:b/>
+          <w:bCs/>
+        </w:rPr>
+        <w:br/>
+      </w:r>
+      <w:r>
+        <w:rPr>
+          <w:rStyle w:val="NormalTok"/>
+          <w:rFonts w:ascii="Courier New" w:hAnsi="Courier New" w:cs="Courier New"/>
+          <w:b/>
+          <w:bCs/>
+        </w:rPr>
+        <w:t>.</w:t>
+      </w:r>
+      <w:proofErr w:type="spellStart"/>
+      <w:r>
+        <w:rPr>
+          <w:rStyle w:val="NormalTok"/>
+          <w:rFonts w:ascii="Courier New" w:hAnsi="Courier New" w:cs="Courier New"/>
+          <w:b/>
+          <w:bCs/>
+        </w:rPr>
+        <w:t>venv</w:t>
+      </w:r>
+      <w:proofErr w:type="spellEnd"/>
+      <w:r>
+        <w:rPr>
+          <w:rStyle w:val="NormalTok"/>
+          <w:rFonts w:ascii="Courier New" w:hAnsi="Courier New" w:cs="Courier New"/>
+          <w:b/>
+          <w:bCs/>
+        </w:rPr>
+        <w:t>\Scripts\</w:t>
+      </w:r>
+      <w:r>
+        <w:rPr>
+          <w:rFonts w:asciiTheme="minorHAnsi" w:hAnsiTheme="minorHAnsi"/>
+        </w:rPr>
+        <w:t xml:space="preserve"> </w:t>
+      </w:r>
+      <w:r>
+        <w:rPr>
+          <w:rFonts w:ascii="Courier New" w:hAnsi="Courier New" w:cs="Courier New"/>
+          <w:b/>
+          <w:bCs/>
+        </w:rPr>
+        <w:t>activate.bat</w:t>
       </w:r>
       <w:r>
         <w:rPr>
@@ -1615,6 +1713,7 @@
         </w:rPr>
         <w:br/>
       </w:r>
+      <w:proofErr w:type="spellStart"/>
       <w:r>
         <w:rPr>
           <w:rStyle w:val="NormalTok"/>
@@ -1625,6 +1724,7 @@
         </w:rPr>
         <w:t>pip</w:t>
       </w:r>
+      <w:proofErr w:type="spellEnd"/>
       <w:r>
         <w:rPr>
           <w:rStyle w:val="NormalTok"/>
@@ -1736,8 +1836,9 @@
           <w:sz w:val="22"/>
           <w:szCs w:val="22"/>
         </w:rPr>
-        <w:t xml:space="preserve"> manage.py m</w:t>
-      </w:r>
+        <w:t xml:space="preserve"> manage.py </w:t>
+      </w:r>
+      <w:proofErr w:type="spellStart"/>
       <w:r>
         <w:rPr>
           <w:rStyle w:val="NormalTok"/>
@@ -1748,7 +1849,32 @@
           <w:sz w:val="22"/>
           <w:szCs w:val="22"/>
         </w:rPr>
-        <w:t>akemigrations app</w:t>
+        <w:t>m</w:t>
+      </w:r>
+      <w:r>
+        <w:rPr>
+          <w:rStyle w:val="NormalTok"/>
+          <w:rFonts w:ascii="Courier New" w:eastAsiaTheme="minorEastAsia" w:hAnsi="Courier New" w:cs="Courier New"/>
+          <w:b/>
+          <w:bCs/>
+          <w:spacing w:val="0"/>
+          <w:sz w:val="22"/>
+          <w:szCs w:val="22"/>
+        </w:rPr>
+        <w:t>akemigrations</w:t>
+      </w:r>
+      <w:proofErr w:type="spellEnd"/>
+      <w:r>
+        <w:rPr>
+          <w:rStyle w:val="NormalTok"/>
+          <w:rFonts w:ascii="Courier New" w:eastAsiaTheme="minorEastAsia" w:hAnsi="Courier New" w:cs="Courier New"/>
+          <w:b/>
+          <w:bCs/>
+          <w:spacing w:val="0"/>
+          <w:sz w:val="22"/>
+          <w:szCs w:val="22"/>
+        </w:rPr>
+        <w:t xml:space="preserve"> app</w:t>
       </w:r>
       <w:r>
         <w:rPr>
@@ -1859,8 +1985,22 @@
           <w:sz w:val="22"/>
           <w:szCs w:val="22"/>
         </w:rPr>
-        <w:t xml:space="preserve"> manage.py createsuperuser</w:t>
-      </w:r>
+        <w:t xml:space="preserve"> manage.py </w:t>
+      </w:r>
+      <w:proofErr w:type="spellStart"/>
+      <w:r>
+        <w:rPr>
+          <w:rStyle w:val="NormalTok"/>
+          <w:rFonts w:ascii="Courier New" w:eastAsiaTheme="minorEastAsia" w:hAnsi="Courier New" w:cs="Courier New"/>
+          <w:b/>
+          <w:bCs/>
+          <w:spacing w:val="0"/>
+          <w:sz w:val="22"/>
+          <w:szCs w:val="22"/>
+        </w:rPr>
+        <w:t>createsuperuser</w:t>
+      </w:r>
+      <w:proofErr w:type="spellEnd"/>
       <w:r>
         <w:rPr>
           <w:rStyle w:val="NormalTok"/>
@@ -1991,8 +2131,20 @@
           <w:bCs/>
           <w:spacing w:val="0"/>
         </w:rPr>
-        <w:t>python manage.py runserver</w:t>
-      </w:r>
+        <w:t xml:space="preserve">python manage.py </w:t>
+      </w:r>
+      <w:proofErr w:type="spellStart"/>
+      <w:r>
+        <w:rPr>
+          <w:rStyle w:val="NormalTok"/>
+          <w:rFonts w:ascii="Courier New" w:eastAsiaTheme="minorEastAsia" w:hAnsi="Courier New" w:cs="Courier New"/>
+          <w:b/>
+          <w:bCs/>
+          <w:spacing w:val="0"/>
+        </w:rPr>
+        <w:t>runserver</w:t>
+      </w:r>
+      <w:proofErr w:type="spellEnd"/>
       <w:r>
         <w:rPr>
           <w:rStyle w:val="NormalTok"/>
@@ -2148,6 +2300,7 @@
         </w:rPr>
         <w:t xml:space="preserve"> model stores usernames, passwords, and account status. </w:t>
       </w:r>
+      <w:proofErr w:type="spellStart"/>
       <w:r>
         <w:rPr>
           <w:rFonts w:ascii="Courier New" w:hAnsi="Courier New" w:cs="Courier New"/>
@@ -2156,6 +2309,7 @@
         </w:rPr>
         <w:t>UserProfile</w:t>
       </w:r>
+      <w:proofErr w:type="spellEnd"/>
       <w:r>
         <w:rPr>
           <w:rFonts w:ascii="Aptos" w:hAnsi="Aptos"/>
@@ -2175,6 +2329,7 @@
           <w:bCs/>
         </w:rPr>
       </w:pPr>
+      <w:proofErr w:type="spellStart"/>
       <w:r>
         <w:rPr>
           <w:rFonts w:ascii="Courier New" w:hAnsi="Courier New" w:cs="Courier New"/>
@@ -2183,6 +2338,7 @@
         </w:rPr>
         <w:t>is_staff</w:t>
       </w:r>
+      <w:proofErr w:type="spellEnd"/>
     </w:p>
     <w:p>
       <w:pPr>
@@ -2196,6 +2352,7 @@
           <w:bCs/>
         </w:rPr>
       </w:pPr>
+      <w:proofErr w:type="spellStart"/>
       <w:r>
         <w:rPr>
           <w:rFonts w:ascii="Courier New" w:hAnsi="Courier New" w:cs="Courier New"/>
@@ -2204,6 +2361,7 @@
         </w:rPr>
         <w:t>is_marker</w:t>
       </w:r>
+      <w:proofErr w:type="spellEnd"/>
     </w:p>
     <w:p>
       <w:pPr>
@@ -2217,6 +2375,7 @@
           <w:bCs/>
         </w:rPr>
       </w:pPr>
+      <w:proofErr w:type="spellStart"/>
       <w:r>
         <w:rPr>
           <w:rFonts w:ascii="Courier New" w:hAnsi="Courier New" w:cs="Courier New"/>
@@ -2225,13 +2384,15 @@
         </w:rPr>
         <w:t>is_course_lead</w:t>
       </w:r>
-    </w:p>
-    <w:p>
-      <w:pPr>
-        <w:rPr>
-          <w:rFonts w:ascii="Aptos" w:hAnsi="Aptos"/>
-        </w:rPr>
-      </w:pPr>
+      <w:proofErr w:type="spellEnd"/>
+    </w:p>
+    <w:p>
+      <w:pPr>
+        <w:rPr>
+          <w:rFonts w:ascii="Aptos" w:hAnsi="Aptos"/>
+        </w:rPr>
+      </w:pPr>
+      <w:proofErr w:type="spellStart"/>
       <w:r>
         <w:rPr>
           <w:rFonts w:ascii="Courier New" w:hAnsi="Courier New" w:cs="Courier New"/>
@@ -2240,6 +2401,7 @@
         </w:rPr>
         <w:t>UserProfile</w:t>
       </w:r>
+      <w:proofErr w:type="spellEnd"/>
       <w:r>
         <w:rPr>
           <w:rFonts w:ascii="Aptos" w:hAnsi="Aptos"/>
@@ -2291,6 +2453,7 @@
         </w:rPr>
         <w:t xml:space="preserve">a </w:t>
       </w:r>
+      <w:proofErr w:type="spellStart"/>
       <w:r>
         <w:rPr>
           <w:rFonts w:ascii="Courier New" w:hAnsi="Courier New" w:cs="Courier New"/>
@@ -2299,6 +2462,7 @@
         </w:rPr>
         <w:t>UserProfile</w:t>
       </w:r>
+      <w:proofErr w:type="spellEnd"/>
       <w:proofErr w:type="gramEnd"/>
       <w:r>
         <w:rPr>
@@ -2325,7 +2489,6 @@
         <w:t xml:space="preserve"> users.</w:t>
       </w:r>
     </w:p>
-    <w:p/>
     <w:p>
       <w:pPr>
         <w:pStyle w:val="Heading3"/>
@@ -2435,13 +2598,23 @@
           <w:rFonts w:ascii="Aptos" w:hAnsi="Aptos"/>
         </w:rPr>
       </w:pPr>
+      <w:proofErr w:type="spellStart"/>
       <w:r>
         <w:rPr>
           <w:rFonts w:ascii="Courier New" w:hAnsi="Courier New" w:cs="Courier New"/>
           <w:b/>
           <w:bCs/>
         </w:rPr>
-        <w:t xml:space="preserve">course_lead: </w:t>
+        <w:t>course_lead</w:t>
+      </w:r>
+      <w:proofErr w:type="spellEnd"/>
+      <w:r>
+        <w:rPr>
+          <w:rFonts w:ascii="Courier New" w:hAnsi="Courier New" w:cs="Courier New"/>
+          <w:b/>
+          <w:bCs/>
+        </w:rPr>
+        <w:t xml:space="preserve">: </w:t>
       </w:r>
       <w:r>
         <w:rPr>
@@ -2558,6 +2731,7 @@
         </w:rPr>
         <w:t xml:space="preserve"> method regenerates the slug from the course code using Django’s </w:t>
       </w:r>
+      <w:proofErr w:type="spellStart"/>
       <w:r>
         <w:rPr>
           <w:rFonts w:ascii="Courier New" w:hAnsi="Courier New" w:cs="Courier New"/>
@@ -2566,6 +2740,7 @@
         </w:rPr>
         <w:t>slugify</w:t>
       </w:r>
+      <w:proofErr w:type="spellEnd"/>
       <w:r>
         <w:rPr>
           <w:rFonts w:ascii="Aptos" w:hAnsi="Aptos"/>
@@ -2974,6 +3149,7 @@
           <w:rFonts w:ascii="Aptos" w:hAnsi="Aptos"/>
         </w:rPr>
       </w:pPr>
+      <w:proofErr w:type="spellStart"/>
       <w:r>
         <w:rPr>
           <w:rFonts w:ascii="Courier New" w:hAnsi="Courier New" w:cs="Courier New"/>
@@ -2982,6 +3158,7 @@
         </w:rPr>
         <w:t>feedback_tone</w:t>
       </w:r>
+      <w:proofErr w:type="spellEnd"/>
       <w:r>
         <w:rPr>
           <w:rFonts w:ascii="Aptos" w:hAnsi="Aptos"/>
@@ -3002,6 +3179,7 @@
           <w:rFonts w:ascii="Aptos" w:hAnsi="Aptos"/>
         </w:rPr>
       </w:pPr>
+      <w:proofErr w:type="spellStart"/>
       <w:r>
         <w:rPr>
           <w:rFonts w:ascii="Courier New" w:hAnsi="Courier New" w:cs="Courier New"/>
@@ -3010,12 +3188,14 @@
         </w:rPr>
         <w:t>feedback_length_min</w:t>
       </w:r>
+      <w:proofErr w:type="spellEnd"/>
       <w:r>
         <w:rPr>
           <w:rFonts w:ascii="Aptos" w:hAnsi="Aptos"/>
         </w:rPr>
         <w:t xml:space="preserve"> and </w:t>
       </w:r>
+      <w:proofErr w:type="spellStart"/>
       <w:r>
         <w:rPr>
           <w:rFonts w:ascii="Courier New" w:hAnsi="Courier New" w:cs="Courier New"/>
@@ -3024,6 +3204,7 @@
         </w:rPr>
         <w:t>feedback_length_max</w:t>
       </w:r>
+      <w:proofErr w:type="spellEnd"/>
       <w:r>
         <w:rPr>
           <w:rFonts w:ascii="Aptos" w:hAnsi="Aptos"/>
@@ -3038,6 +3219,7 @@
           <w:rFonts w:ascii="Aptos" w:hAnsi="Aptos"/>
         </w:rPr>
       </w:pPr>
+      <w:proofErr w:type="spellStart"/>
       <w:r>
         <w:rPr>
           <w:rFonts w:ascii="Courier New" w:hAnsi="Courier New" w:cs="Courier New"/>
@@ -3046,6 +3228,7 @@
         </w:rPr>
         <w:t>feedback_moderation_requests</w:t>
       </w:r>
+      <w:proofErr w:type="spellEnd"/>
       <w:r>
         <w:rPr>
           <w:rFonts w:ascii="Aptos" w:hAnsi="Aptos"/>
@@ -3066,6 +3249,7 @@
           <w:rFonts w:ascii="Aptos" w:hAnsi="Aptos"/>
         </w:rPr>
       </w:pPr>
+      <w:proofErr w:type="spellStart"/>
       <w:r>
         <w:rPr>
           <w:rFonts w:ascii="Courier New" w:hAnsi="Courier New" w:cs="Courier New"/>
@@ -3074,6 +3258,7 @@
         </w:rPr>
         <w:t>feedback_moderation_prompt</w:t>
       </w:r>
+      <w:proofErr w:type="spellEnd"/>
       <w:r>
         <w:rPr>
           <w:rFonts w:ascii="Aptos" w:hAnsi="Aptos"/>
@@ -3110,6 +3295,7 @@
           <w:bCs/>
         </w:rPr>
       </w:pPr>
+      <w:proofErr w:type="spellStart"/>
       <w:r>
         <w:rPr>
           <w:rFonts w:ascii="Aptos" w:hAnsi="Aptos"/>
@@ -3118,6 +3304,7 @@
         </w:rPr>
         <w:t>MarkedSubmission</w:t>
       </w:r>
+      <w:proofErr w:type="spellEnd"/>
     </w:p>
     <w:p>
       <w:pPr>
@@ -3131,6 +3318,7 @@
         </w:rPr>
         <w:t xml:space="preserve">A </w:t>
       </w:r>
+      <w:proofErr w:type="spellStart"/>
       <w:r>
         <w:rPr>
           <w:rFonts w:ascii="Courier New" w:hAnsi="Courier New" w:cs="Courier New"/>
@@ -3139,6 +3327,7 @@
         </w:rPr>
         <w:t>MarkedSubmission</w:t>
       </w:r>
+      <w:proofErr w:type="spellEnd"/>
       <w:r>
         <w:rPr>
           <w:rFonts w:ascii="Aptos" w:hAnsi="Aptos"/>
@@ -3177,13 +3366,23 @@
           <w:rFonts w:ascii="Aptos" w:hAnsi="Aptos"/>
         </w:rPr>
       </w:pPr>
+      <w:proofErr w:type="spellStart"/>
       <w:r>
         <w:rPr>
           <w:rFonts w:ascii="Courier New" w:hAnsi="Courier New" w:cs="Courier New"/>
           <w:b/>
           <w:bCs/>
         </w:rPr>
-        <w:t>student_cid:</w:t>
+        <w:t>student_cid</w:t>
+      </w:r>
+      <w:proofErr w:type="spellEnd"/>
+      <w:r>
+        <w:rPr>
+          <w:rFonts w:ascii="Courier New" w:hAnsi="Courier New" w:cs="Courier New"/>
+          <w:b/>
+          <w:bCs/>
+        </w:rPr>
+        <w:t>:</w:t>
       </w:r>
       <w:r>
         <w:rPr>
@@ -3291,13 +3490,23 @@
           <w:rFonts w:ascii="Aptos" w:hAnsi="Aptos"/>
         </w:rPr>
       </w:pPr>
+      <w:proofErr w:type="spellStart"/>
       <w:r>
         <w:rPr>
           <w:rFonts w:ascii="Courier New" w:hAnsi="Courier New" w:cs="Courier New"/>
           <w:b/>
           <w:bCs/>
         </w:rPr>
-        <w:t>marker_grade:</w:t>
+        <w:t>marker_grade</w:t>
+      </w:r>
+      <w:proofErr w:type="spellEnd"/>
+      <w:r>
+        <w:rPr>
+          <w:rFonts w:ascii="Courier New" w:hAnsi="Courier New" w:cs="Courier New"/>
+          <w:b/>
+          <w:bCs/>
+        </w:rPr>
+        <w:t>:</w:t>
       </w:r>
       <w:r>
         <w:rPr>
@@ -3319,13 +3528,23 @@
           <w:rFonts w:ascii="Aptos" w:hAnsi="Aptos"/>
         </w:rPr>
       </w:pPr>
+      <w:proofErr w:type="spellStart"/>
       <w:r>
         <w:rPr>
           <w:rFonts w:ascii="Courier New" w:hAnsi="Courier New" w:cs="Courier New"/>
           <w:b/>
           <w:bCs/>
         </w:rPr>
-        <w:t>initial_marker_feedback:</w:t>
+        <w:t>initial_marker_feedback</w:t>
+      </w:r>
+      <w:proofErr w:type="spellEnd"/>
+      <w:r>
+        <w:rPr>
+          <w:rFonts w:ascii="Courier New" w:hAnsi="Courier New" w:cs="Courier New"/>
+          <w:b/>
+          <w:bCs/>
+        </w:rPr>
+        <w:t>:</w:t>
       </w:r>
       <w:r>
         <w:rPr>
@@ -3347,13 +3566,23 @@
           <w:rFonts w:ascii="Aptos" w:hAnsi="Aptos"/>
         </w:rPr>
       </w:pPr>
+      <w:proofErr w:type="spellStart"/>
       <w:r>
         <w:rPr>
           <w:rFonts w:ascii="Courier New" w:hAnsi="Courier New" w:cs="Courier New"/>
           <w:b/>
           <w:bCs/>
         </w:rPr>
-        <w:t>suggested_improvements:</w:t>
+        <w:t>suggested_improvements</w:t>
+      </w:r>
+      <w:proofErr w:type="spellEnd"/>
+      <w:r>
+        <w:rPr>
+          <w:rFonts w:ascii="Courier New" w:hAnsi="Courier New" w:cs="Courier New"/>
+          <w:b/>
+          <w:bCs/>
+        </w:rPr>
+        <w:t>:</w:t>
       </w:r>
       <w:r>
         <w:rPr>
@@ -3375,13 +3604,23 @@
           <w:rFonts w:ascii="Aptos" w:hAnsi="Aptos"/>
         </w:rPr>
       </w:pPr>
+      <w:proofErr w:type="spellStart"/>
       <w:r>
         <w:rPr>
           <w:rFonts w:ascii="Courier New" w:hAnsi="Courier New" w:cs="Courier New"/>
           <w:b/>
           <w:bCs/>
         </w:rPr>
-        <w:t>improved_marker_feedback:</w:t>
+        <w:t>improved_marker_feedback</w:t>
+      </w:r>
+      <w:proofErr w:type="spellEnd"/>
+      <w:r>
+        <w:rPr>
+          <w:rFonts w:ascii="Courier New" w:hAnsi="Courier New" w:cs="Courier New"/>
+          <w:b/>
+          <w:bCs/>
+        </w:rPr>
+        <w:t>:</w:t>
       </w:r>
       <w:r>
         <w:rPr>
@@ -3403,13 +3642,23 @@
           <w:rFonts w:ascii="Aptos" w:hAnsi="Aptos"/>
         </w:rPr>
       </w:pPr>
+      <w:proofErr w:type="spellStart"/>
       <w:r>
         <w:rPr>
           <w:rFonts w:ascii="Courier New" w:hAnsi="Courier New" w:cs="Courier New"/>
           <w:b/>
           <w:bCs/>
         </w:rPr>
-        <w:t>moderated_grade:</w:t>
+        <w:t>moderated_grade</w:t>
+      </w:r>
+      <w:proofErr w:type="spellEnd"/>
+      <w:r>
+        <w:rPr>
+          <w:rFonts w:ascii="Courier New" w:hAnsi="Courier New" w:cs="Courier New"/>
+          <w:b/>
+          <w:bCs/>
+        </w:rPr>
+        <w:t>:</w:t>
       </w:r>
       <w:r>
         <w:rPr>
@@ -3443,13 +3692,23 @@
           <w:rFonts w:ascii="Aptos" w:hAnsi="Aptos"/>
         </w:rPr>
       </w:pPr>
+      <w:proofErr w:type="spellStart"/>
       <w:r>
         <w:rPr>
           <w:rFonts w:ascii="Courier New" w:hAnsi="Courier New" w:cs="Courier New"/>
           <w:b/>
           <w:bCs/>
         </w:rPr>
-        <w:t>moderated_feedback:</w:t>
+        <w:t>moderated_feedback</w:t>
+      </w:r>
+      <w:proofErr w:type="spellEnd"/>
+      <w:r>
+        <w:rPr>
+          <w:rFonts w:ascii="Courier New" w:hAnsi="Courier New" w:cs="Courier New"/>
+          <w:b/>
+          <w:bCs/>
+        </w:rPr>
+        <w:t>:</w:t>
       </w:r>
       <w:r>
         <w:rPr>
@@ -4496,7 +4755,25 @@
                 <w:b/>
                 <w:bCs/>
               </w:rPr>
-              <w:t>/app/course-&lt;course_slug&gt;/</w:t>
+              <w:t>/app/course-&lt;</w:t>
+            </w:r>
+            <w:proofErr w:type="spellStart"/>
+            <w:r>
+              <w:rPr>
+                <w:rFonts w:ascii="Courier New" w:hAnsi="Courier New" w:cs="Courier New"/>
+                <w:b/>
+                <w:bCs/>
+              </w:rPr>
+              <w:t>course_slug</w:t>
+            </w:r>
+            <w:proofErr w:type="spellEnd"/>
+            <w:r>
+              <w:rPr>
+                <w:rFonts w:ascii="Courier New" w:hAnsi="Courier New" w:cs="Courier New"/>
+                <w:b/>
+                <w:bCs/>
+              </w:rPr>
+              <w:t>&gt;/</w:t>
             </w:r>
           </w:p>
         </w:tc>
@@ -4556,7 +4833,25 @@
                 <w:b/>
                 <w:bCs/>
               </w:rPr>
-              <w:t>/app/course-&lt;course_slug&gt;/manage/</w:t>
+              <w:t>/app/course-&lt;</w:t>
+            </w:r>
+            <w:proofErr w:type="spellStart"/>
+            <w:r>
+              <w:rPr>
+                <w:rFonts w:ascii="Courier New" w:hAnsi="Courier New" w:cs="Courier New"/>
+                <w:b/>
+                <w:bCs/>
+              </w:rPr>
+              <w:t>course_slug</w:t>
+            </w:r>
+            <w:proofErr w:type="spellEnd"/>
+            <w:r>
+              <w:rPr>
+                <w:rFonts w:ascii="Courier New" w:hAnsi="Courier New" w:cs="Courier New"/>
+                <w:b/>
+                <w:bCs/>
+              </w:rPr>
+              <w:t>&gt;/manage/</w:t>
             </w:r>
           </w:p>
         </w:tc>
@@ -4616,7 +4911,25 @@
                 <w:b/>
                 <w:bCs/>
               </w:rPr>
-              <w:t>/app/course-&lt;course_slug&gt;/delete/</w:t>
+              <w:t>/app/course-&lt;</w:t>
+            </w:r>
+            <w:proofErr w:type="spellStart"/>
+            <w:r>
+              <w:rPr>
+                <w:rFonts w:ascii="Courier New" w:hAnsi="Courier New" w:cs="Courier New"/>
+                <w:b/>
+                <w:bCs/>
+              </w:rPr>
+              <w:t>course_slug</w:t>
+            </w:r>
+            <w:proofErr w:type="spellEnd"/>
+            <w:r>
+              <w:rPr>
+                <w:rFonts w:ascii="Courier New" w:hAnsi="Courier New" w:cs="Courier New"/>
+                <w:b/>
+                <w:bCs/>
+              </w:rPr>
+              <w:t>&gt;/delete/</w:t>
             </w:r>
           </w:p>
         </w:tc>
@@ -4676,7 +4989,25 @@
                 <w:b/>
                 <w:bCs/>
               </w:rPr>
-              <w:t>/app/course-&lt;course_slug&gt;/new-assignment/</w:t>
+              <w:t>/app/course-&lt;</w:t>
+            </w:r>
+            <w:proofErr w:type="spellStart"/>
+            <w:r>
+              <w:rPr>
+                <w:rFonts w:ascii="Courier New" w:hAnsi="Courier New" w:cs="Courier New"/>
+                <w:b/>
+                <w:bCs/>
+              </w:rPr>
+              <w:t>course_slug</w:t>
+            </w:r>
+            <w:proofErr w:type="spellEnd"/>
+            <w:r>
+              <w:rPr>
+                <w:rFonts w:ascii="Courier New" w:hAnsi="Courier New" w:cs="Courier New"/>
+                <w:b/>
+                <w:bCs/>
+              </w:rPr>
+              <w:t>&gt;/new-assignment/</w:t>
             </w:r>
           </w:p>
         </w:tc>
@@ -4736,7 +5067,43 @@
                 <w:b/>
                 <w:bCs/>
               </w:rPr>
-              <w:t>/app/course-&lt;course_slug&gt;/assignment-&lt;assignment_id&gt;/</w:t>
+              <w:t>/app/course-&lt;</w:t>
+            </w:r>
+            <w:proofErr w:type="spellStart"/>
+            <w:r>
+              <w:rPr>
+                <w:rFonts w:ascii="Courier New" w:hAnsi="Courier New" w:cs="Courier New"/>
+                <w:b/>
+                <w:bCs/>
+              </w:rPr>
+              <w:t>course_slug</w:t>
+            </w:r>
+            <w:proofErr w:type="spellEnd"/>
+            <w:r>
+              <w:rPr>
+                <w:rFonts w:ascii="Courier New" w:hAnsi="Courier New" w:cs="Courier New"/>
+                <w:b/>
+                <w:bCs/>
+              </w:rPr>
+              <w:t>&gt;/assignment-&lt;</w:t>
+            </w:r>
+            <w:proofErr w:type="spellStart"/>
+            <w:r>
+              <w:rPr>
+                <w:rFonts w:ascii="Courier New" w:hAnsi="Courier New" w:cs="Courier New"/>
+                <w:b/>
+                <w:bCs/>
+              </w:rPr>
+              <w:t>assignment_id</w:t>
+            </w:r>
+            <w:proofErr w:type="spellEnd"/>
+            <w:r>
+              <w:rPr>
+                <w:rFonts w:ascii="Courier New" w:hAnsi="Courier New" w:cs="Courier New"/>
+                <w:b/>
+                <w:bCs/>
+              </w:rPr>
+              <w:t>&gt;/</w:t>
             </w:r>
           </w:p>
         </w:tc>
@@ -4797,7 +5164,61 @@
                 <w:b/>
                 <w:bCs/>
               </w:rPr>
-              <w:t>/app/course-&lt;course_slug&gt;/assignment-&lt;assignment_id&gt;/export_csv/</w:t>
+              <w:t>/app/course-&lt;</w:t>
+            </w:r>
+            <w:proofErr w:type="spellStart"/>
+            <w:r>
+              <w:rPr>
+                <w:rFonts w:ascii="Courier New" w:hAnsi="Courier New" w:cs="Courier New"/>
+                <w:b/>
+                <w:bCs/>
+              </w:rPr>
+              <w:t>course_slug</w:t>
+            </w:r>
+            <w:proofErr w:type="spellEnd"/>
+            <w:r>
+              <w:rPr>
+                <w:rFonts w:ascii="Courier New" w:hAnsi="Courier New" w:cs="Courier New"/>
+                <w:b/>
+                <w:bCs/>
+              </w:rPr>
+              <w:t>&gt;/assignment-&lt;</w:t>
+            </w:r>
+            <w:proofErr w:type="spellStart"/>
+            <w:r>
+              <w:rPr>
+                <w:rFonts w:ascii="Courier New" w:hAnsi="Courier New" w:cs="Courier New"/>
+                <w:b/>
+                <w:bCs/>
+              </w:rPr>
+              <w:t>assignment_id</w:t>
+            </w:r>
+            <w:proofErr w:type="spellEnd"/>
+            <w:r>
+              <w:rPr>
+                <w:rFonts w:ascii="Courier New" w:hAnsi="Courier New" w:cs="Courier New"/>
+                <w:b/>
+                <w:bCs/>
+              </w:rPr>
+              <w:t>&gt;/</w:t>
+            </w:r>
+            <w:proofErr w:type="spellStart"/>
+            <w:r>
+              <w:rPr>
+                <w:rFonts w:ascii="Courier New" w:hAnsi="Courier New" w:cs="Courier New"/>
+                <w:b/>
+                <w:bCs/>
+              </w:rPr>
+              <w:t>export_csv</w:t>
+            </w:r>
+            <w:proofErr w:type="spellEnd"/>
+            <w:r>
+              <w:rPr>
+                <w:rFonts w:ascii="Courier New" w:hAnsi="Courier New" w:cs="Courier New"/>
+                <w:b/>
+                <w:bCs/>
+              </w:rPr>
+              <w:t>/</w:t>
             </w:r>
           </w:p>
         </w:tc>
@@ -4877,7 +5298,43 @@
                 <w:b/>
                 <w:bCs/>
               </w:rPr>
-              <w:t>/app/course-&lt;course_slug&gt;/assignment-&lt;assignment_id&gt;/manage/</w:t>
+              <w:t>/app/course-&lt;</w:t>
+            </w:r>
+            <w:proofErr w:type="spellStart"/>
+            <w:r>
+              <w:rPr>
+                <w:rFonts w:ascii="Courier New" w:hAnsi="Courier New" w:cs="Courier New"/>
+                <w:b/>
+                <w:bCs/>
+              </w:rPr>
+              <w:t>course_slug</w:t>
+            </w:r>
+            <w:proofErr w:type="spellEnd"/>
+            <w:r>
+              <w:rPr>
+                <w:rFonts w:ascii="Courier New" w:hAnsi="Courier New" w:cs="Courier New"/>
+                <w:b/>
+                <w:bCs/>
+              </w:rPr>
+              <w:t>&gt;/assignment-&lt;</w:t>
+            </w:r>
+            <w:proofErr w:type="spellStart"/>
+            <w:r>
+              <w:rPr>
+                <w:rFonts w:ascii="Courier New" w:hAnsi="Courier New" w:cs="Courier New"/>
+                <w:b/>
+                <w:bCs/>
+              </w:rPr>
+              <w:t>assignment_id</w:t>
+            </w:r>
+            <w:proofErr w:type="spellEnd"/>
+            <w:r>
+              <w:rPr>
+                <w:rFonts w:ascii="Courier New" w:hAnsi="Courier New" w:cs="Courier New"/>
+                <w:b/>
+                <w:bCs/>
+              </w:rPr>
+              <w:t>&gt;/manage/</w:t>
             </w:r>
           </w:p>
         </w:tc>
@@ -4937,7 +5394,43 @@
                 <w:b/>
                 <w:bCs/>
               </w:rPr>
-              <w:t>/app/course-&lt;course_slug&gt;/assignment-&lt;assignment_id&gt;/delete/</w:t>
+              <w:t>/app/course-&lt;</w:t>
+            </w:r>
+            <w:proofErr w:type="spellStart"/>
+            <w:r>
+              <w:rPr>
+                <w:rFonts w:ascii="Courier New" w:hAnsi="Courier New" w:cs="Courier New"/>
+                <w:b/>
+                <w:bCs/>
+              </w:rPr>
+              <w:t>course_slug</w:t>
+            </w:r>
+            <w:proofErr w:type="spellEnd"/>
+            <w:r>
+              <w:rPr>
+                <w:rFonts w:ascii="Courier New" w:hAnsi="Courier New" w:cs="Courier New"/>
+                <w:b/>
+                <w:bCs/>
+              </w:rPr>
+              <w:t>&gt;/assignment-&lt;</w:t>
+            </w:r>
+            <w:proofErr w:type="spellStart"/>
+            <w:r>
+              <w:rPr>
+                <w:rFonts w:ascii="Courier New" w:hAnsi="Courier New" w:cs="Courier New"/>
+                <w:b/>
+                <w:bCs/>
+              </w:rPr>
+              <w:t>assignment_id</w:t>
+            </w:r>
+            <w:proofErr w:type="spellEnd"/>
+            <w:r>
+              <w:rPr>
+                <w:rFonts w:ascii="Courier New" w:hAnsi="Courier New" w:cs="Courier New"/>
+                <w:b/>
+                <w:bCs/>
+              </w:rPr>
+              <w:t>&gt;/delete/</w:t>
             </w:r>
           </w:p>
         </w:tc>
@@ -5378,6 +5871,7 @@
           <w:rFonts w:ascii="Aptos" w:hAnsi="Aptos"/>
         </w:rPr>
       </w:pPr>
+      <w:proofErr w:type="spellStart"/>
       <w:r>
         <w:rPr>
           <w:rFonts w:ascii="Courier New" w:hAnsi="Courier New" w:cs="Courier New"/>
@@ -5386,6 +5880,7 @@
         </w:rPr>
         <w:t>CourseForm</w:t>
       </w:r>
+      <w:proofErr w:type="spellEnd"/>
       <w:r>
         <w:rPr>
           <w:rFonts w:ascii="Aptos" w:hAnsi="Aptos"/>
@@ -5434,6 +5929,7 @@
           <w:rFonts w:ascii="Aptos" w:hAnsi="Aptos"/>
         </w:rPr>
       </w:pPr>
+      <w:proofErr w:type="spellStart"/>
       <w:r>
         <w:rPr>
           <w:rFonts w:ascii="Courier New" w:hAnsi="Courier New" w:cs="Courier New"/>
@@ -5442,6 +5938,7 @@
         </w:rPr>
         <w:t>AssignmentForm</w:t>
       </w:r>
+      <w:proofErr w:type="spellEnd"/>
       <w:r>
         <w:rPr>
           <w:rFonts w:ascii="Aptos" w:hAnsi="Aptos"/>
@@ -5462,6 +5959,7 @@
           <w:rFonts w:ascii="Aptos" w:hAnsi="Aptos"/>
         </w:rPr>
       </w:pPr>
+      <w:proofErr w:type="spellStart"/>
       <w:r>
         <w:rPr>
           <w:rFonts w:ascii="Courier New" w:hAnsi="Courier New" w:cs="Courier New"/>
@@ -5470,6 +5968,7 @@
         </w:rPr>
         <w:t>GradeModerationForm</w:t>
       </w:r>
+      <w:proofErr w:type="spellEnd"/>
       <w:r>
         <w:rPr>
           <w:rFonts w:ascii="Aptos" w:hAnsi="Aptos"/>
@@ -5502,6 +6001,7 @@
           <w:rFonts w:ascii="Aptos" w:hAnsi="Aptos"/>
         </w:rPr>
       </w:pPr>
+      <w:proofErr w:type="spellStart"/>
       <w:r>
         <w:rPr>
           <w:rFonts w:ascii="Courier New" w:hAnsi="Courier New" w:cs="Courier New"/>
@@ -5510,6 +6010,7 @@
         </w:rPr>
         <w:t>FeedbackModerationForm</w:t>
       </w:r>
+      <w:proofErr w:type="spellEnd"/>
       <w:r>
         <w:rPr>
           <w:rFonts w:ascii="Aptos" w:hAnsi="Aptos"/>
@@ -5530,6 +6031,7 @@
           <w:rFonts w:ascii="Aptos" w:hAnsi="Aptos"/>
         </w:rPr>
       </w:pPr>
+      <w:proofErr w:type="spellStart"/>
       <w:r>
         <w:rPr>
           <w:rFonts w:ascii="Courier New" w:hAnsi="Courier New" w:cs="Courier New"/>
@@ -5538,6 +6040,7 @@
         </w:rPr>
         <w:t>MarkedSubmissionForm</w:t>
       </w:r>
+      <w:proofErr w:type="spellEnd"/>
       <w:r>
         <w:rPr>
           <w:rFonts w:ascii="Aptos" w:hAnsi="Aptos"/>
@@ -5570,6 +6073,7 @@
           <w:rFonts w:ascii="Aptos" w:hAnsi="Aptos"/>
         </w:rPr>
       </w:pPr>
+      <w:proofErr w:type="spellStart"/>
       <w:r>
         <w:rPr>
           <w:rFonts w:ascii="Courier New" w:hAnsi="Courier New" w:cs="Courier New"/>
@@ -5578,6 +6082,7 @@
         </w:rPr>
         <w:t>UserForm</w:t>
       </w:r>
+      <w:proofErr w:type="spellEnd"/>
       <w:r>
         <w:rPr>
           <w:rFonts w:ascii="Aptos" w:hAnsi="Aptos"/>
@@ -5595,7 +6100,21 @@
         <w:rPr>
           <w:rFonts w:ascii="Aptos" w:hAnsi="Aptos"/>
         </w:rPr>
-        <w:t>Important validation behaviour includes:</w:t>
+        <w:t xml:space="preserve">Important validation </w:t>
+      </w:r>
+      <w:proofErr w:type="spellStart"/>
+      <w:r>
+        <w:rPr>
+          <w:rFonts w:ascii="Aptos" w:hAnsi="Aptos"/>
+        </w:rPr>
+        <w:t>behaviour</w:t>
+      </w:r>
+      <w:proofErr w:type="spellEnd"/>
+      <w:r>
+        <w:rPr>
+          <w:rFonts w:ascii="Aptos" w:hAnsi="Aptos"/>
+        </w:rPr>
+        <w:t xml:space="preserve"> includes:</w:t>
       </w:r>
     </w:p>
     <w:p>
@@ -6202,6 +6721,7 @@
         </w:rPr>
         <w:t xml:space="preserve">e, and only </w:t>
       </w:r>
+      <w:proofErr w:type="spellStart"/>
       <w:r>
         <w:rPr>
           <w:rFonts w:ascii="Courier New" w:hAnsi="Courier New" w:cs="Courier New"/>
@@ -6210,6 +6730,7 @@
         </w:rPr>
         <w:t>MarkedSubmissions</w:t>
       </w:r>
+      <w:proofErr w:type="spellEnd"/>
       <w:r>
         <w:rPr>
           <w:rFonts w:ascii="Aptos" w:hAnsi="Aptos"/>
@@ -6411,6 +6932,13 @@
     </w:p>
     <w:p>
       <w:pPr>
+        <w:rPr>
+          <w:rFonts w:ascii="Aptos" w:hAnsi="Aptos"/>
+        </w:rPr>
+      </w:pPr>
+    </w:p>
+    <w:p>
+      <w:pPr>
         <w:pStyle w:val="Heading3"/>
         <w:spacing w:after="120"/>
         <w:rPr>
@@ -6425,6 +6953,7 @@
           <w:b/>
           <w:bCs/>
         </w:rPr>
+        <w:lastRenderedPageBreak/>
         <w:t>10</w:t>
       </w:r>
       <w:r>
@@ -6442,13 +6971,23 @@
           <w:rFonts w:ascii="Aptos" w:hAnsi="Aptos"/>
         </w:rPr>
       </w:pPr>
+      <w:proofErr w:type="spellStart"/>
       <w:r>
         <w:rPr>
           <w:rFonts w:ascii="Courier New" w:hAnsi="Courier New" w:cs="Courier New"/>
           <w:b/>
           <w:bCs/>
         </w:rPr>
-        <w:t>get_suggested_improvements_prompt(submission)</w:t>
+        <w:t>get_suggested_improvements_prompt</w:t>
+      </w:r>
+      <w:proofErr w:type="spellEnd"/>
+      <w:r>
+        <w:rPr>
+          <w:rFonts w:ascii="Courier New" w:hAnsi="Courier New" w:cs="Courier New"/>
+          <w:b/>
+          <w:bCs/>
+        </w:rPr>
+        <w:t>(submission)</w:t>
       </w:r>
       <w:r>
         <w:rPr>
@@ -6468,7 +7007,6 @@
         <w:rPr>
           <w:rFonts w:ascii="Aptos" w:hAnsi="Aptos"/>
         </w:rPr>
-        <w:lastRenderedPageBreak/>
         <w:t>The assignment specification, if available</w:t>
       </w:r>
       <w:r>
@@ -6592,13 +7130,23 @@
           <w:rFonts w:ascii="Aptos" w:hAnsi="Aptos"/>
         </w:rPr>
       </w:pPr>
+      <w:proofErr w:type="spellStart"/>
       <w:r>
         <w:rPr>
           <w:rFonts w:ascii="Courier New" w:hAnsi="Courier New" w:cs="Courier New"/>
           <w:b/>
           <w:bCs/>
         </w:rPr>
-        <w:t>get_feedback_moderation_prompt(assignment)</w:t>
+        <w:t>get_feedback_moderation_prompt</w:t>
+      </w:r>
+      <w:proofErr w:type="spellEnd"/>
+      <w:r>
+        <w:rPr>
+          <w:rFonts w:ascii="Courier New" w:hAnsi="Courier New" w:cs="Courier New"/>
+          <w:b/>
+          <w:bCs/>
+        </w:rPr>
+        <w:t>(assignment)</w:t>
       </w:r>
       <w:r>
         <w:rPr>
@@ -6755,6 +7303,7 @@
         </w:rPr>
         <w:t xml:space="preserve">, as expected by the existing </w:t>
       </w:r>
+      <w:proofErr w:type="spellStart"/>
       <w:r>
         <w:rPr>
           <w:rFonts w:ascii="Courier New" w:hAnsi="Courier New" w:cs="Courier New"/>
@@ -6763,6 +7312,7 @@
         </w:rPr>
         <w:t>MarkedSubmission</w:t>
       </w:r>
+      <w:proofErr w:type="spellEnd"/>
       <w:r>
         <w:rPr>
           <w:rFonts w:ascii="Aptos" w:hAnsi="Aptos"/>
@@ -7260,7 +7810,21 @@
         <w:rPr>
           <w:rFonts w:ascii="Aptos" w:hAnsi="Aptos"/>
         </w:rPr>
-        <w:t>The LLM should be instructed not to invent criteria, penalise work for requirements absent from the rubric, or make claims that cannot be supported by the supplied evidence.</w:t>
+        <w:t xml:space="preserve">The LLM should be instructed not to invent criteria, </w:t>
+      </w:r>
+      <w:proofErr w:type="spellStart"/>
+      <w:r>
+        <w:rPr>
+          <w:rFonts w:ascii="Aptos" w:hAnsi="Aptos"/>
+        </w:rPr>
+        <w:t>penalise</w:t>
+      </w:r>
+      <w:proofErr w:type="spellEnd"/>
+      <w:r>
+        <w:rPr>
+          <w:rFonts w:ascii="Aptos" w:hAnsi="Aptos"/>
+        </w:rPr>
+        <w:t xml:space="preserve"> work for requirements absent from the rubric, or make claims that cannot be supported by the supplied evidence.</w:t>
       </w:r>
       <w:r>
         <w:rPr>
@@ -7369,7 +7933,21 @@
         <w:rPr>
           <w:rFonts w:ascii="Aptos" w:hAnsi="Aptos"/>
         </w:rPr>
-        <w:t xml:space="preserve">“Friendly” should not mean informal, patronising or excessively positive. </w:t>
+        <w:t xml:space="preserve">“Friendly” should not mean informal, </w:t>
+      </w:r>
+      <w:proofErr w:type="spellStart"/>
+      <w:r>
+        <w:rPr>
+          <w:rFonts w:ascii="Aptos" w:hAnsi="Aptos"/>
+        </w:rPr>
+        <w:t>patronising</w:t>
+      </w:r>
+      <w:proofErr w:type="spellEnd"/>
+      <w:r>
+        <w:rPr>
+          <w:rFonts w:ascii="Aptos" w:hAnsi="Aptos"/>
+        </w:rPr>
+        <w:t xml:space="preserve"> or excessively positive. </w:t>
       </w:r>
     </w:p>
     <w:p>
@@ -7409,6 +7987,7 @@
         <w:rPr>
           <w:rFonts w:ascii="Aptos" w:hAnsi="Aptos"/>
         </w:rPr>
+        <w:lastRenderedPageBreak/>
         <w:t>Importantly, the f</w:t>
       </w:r>
       <w:r>
@@ -7485,7 +8064,6 @@
         <w:rPr>
           <w:rFonts w:ascii="Aptos" w:hAnsi="Aptos"/>
         </w:rPr>
-        <w:lastRenderedPageBreak/>
         <w:t xml:space="preserve">The interface should </w:t>
       </w:r>
       <w:r>
@@ -7740,7 +8318,21 @@
         <w:rPr>
           <w:rFonts w:ascii="Aptos" w:hAnsi="Aptos"/>
         </w:rPr>
-        <w:t>Remove or minimise personal data</w:t>
+        <w:t xml:space="preserve">Remove or </w:t>
+      </w:r>
+      <w:proofErr w:type="spellStart"/>
+      <w:r>
+        <w:rPr>
+          <w:rFonts w:ascii="Aptos" w:hAnsi="Aptos"/>
+        </w:rPr>
+        <w:t>minimise</w:t>
+      </w:r>
+      <w:proofErr w:type="spellEnd"/>
+      <w:r>
+        <w:rPr>
+          <w:rFonts w:ascii="Aptos" w:hAnsi="Aptos"/>
+        </w:rPr>
+        <w:t xml:space="preserve"> personal data</w:t>
       </w:r>
       <w:r>
         <w:rPr>
@@ -8326,7 +8918,25 @@
           <w:b/>
           <w:bCs/>
         </w:rPr>
-        <w:t>`python manage.py collectstatic`</w:t>
+        <w:t xml:space="preserve">`python manage.py </w:t>
+      </w:r>
+      <w:proofErr w:type="spellStart"/>
+      <w:r>
+        <w:rPr>
+          <w:rFonts w:ascii="Courier New" w:hAnsi="Courier New" w:cs="Courier New"/>
+          <w:b/>
+          <w:bCs/>
+        </w:rPr>
+        <w:t>collectstatic</w:t>
+      </w:r>
+      <w:proofErr w:type="spellEnd"/>
+      <w:r>
+        <w:rPr>
+          <w:rFonts w:ascii="Courier New" w:hAnsi="Courier New" w:cs="Courier New"/>
+          <w:b/>
+          <w:bCs/>
+        </w:rPr>
+        <w:t>`</w:t>
       </w:r>
       <w:r>
         <w:rPr>
@@ -8380,6 +8990,7 @@
         <w:rPr>
           <w:rFonts w:ascii="Aptos" w:hAnsi="Aptos"/>
         </w:rPr>
+        <w:lastRenderedPageBreak/>
         <w:t xml:space="preserve">Do not use the sample credentials from </w:t>
       </w:r>
       <w:r>
@@ -8504,7 +9115,6 @@
           <w:b/>
           <w:bCs/>
         </w:rPr>
-        <w:lastRenderedPageBreak/>
         <w:t>app/tests.py</w:t>
       </w:r>
       <w:r>
@@ -8537,8 +9147,16 @@
         <w:rPr>
           <w:rFonts w:ascii="Aptos" w:hAnsi="Aptos"/>
         </w:rPr>
-        <w:t>Model constraints and deletion behaviour</w:t>
-      </w:r>
+        <w:t xml:space="preserve">Model constraints and deletion </w:t>
+      </w:r>
+      <w:proofErr w:type="spellStart"/>
+      <w:r>
+        <w:rPr>
+          <w:rFonts w:ascii="Aptos" w:hAnsi="Aptos"/>
+        </w:rPr>
+        <w:t>behaviour</w:t>
+      </w:r>
+      <w:proofErr w:type="spellEnd"/>
       <w:r>
         <w:rPr>
           <w:rFonts w:ascii="Aptos" w:hAnsi="Aptos"/>
@@ -8705,8 +9323,16 @@
         <w:rPr>
           <w:rFonts w:ascii="Aptos" w:hAnsi="Aptos"/>
         </w:rPr>
-        <w:t>Authentication and SSO callback behaviour</w:t>
-      </w:r>
+        <w:t xml:space="preserve">Authentication and SSO callback </w:t>
+      </w:r>
+      <w:proofErr w:type="spellStart"/>
+      <w:r>
+        <w:rPr>
+          <w:rFonts w:ascii="Aptos" w:hAnsi="Aptos"/>
+        </w:rPr>
+        <w:t>behaviour</w:t>
+      </w:r>
+      <w:proofErr w:type="spellEnd"/>
       <w:r>
         <w:rPr>
           <w:rFonts w:ascii="Aptos" w:hAnsi="Aptos"/>
@@ -10559,7 +11185,6 @@
   <w:style w:type="character" w:default="1" w:styleId="DefaultParagraphFont">
     <w:name w:val="Default Paragraph Font"/>
     <w:uiPriority w:val="1"/>
-    <w:semiHidden/>
     <w:unhideWhenUsed/>
   </w:style>
   <w:style w:type="table" w:default="1" w:styleId="TableNormal">

</xml_diff>